<commit_message>
Quitar el PIN de bloqueo: el acceso queda con el login
El sistema lo usa solo el dueño y el login con email/contraseña ya
protege los datos. Se quitan la pantalla de PIN, el botón 🔒 y APP_PIN,
y se limpia la clave rpos_unlocked que quedaba en las PCs. README,
schema y documentación actualizados.

Co-Authored-By: Claude Opus 5.5 <noreply@anthropic.com>
Claude-Session: https://claude.ai/code/session_018ujA1rRX8C8pBTZ6YpJgTf
</commit_message>
<xml_diff>
--- a/RepuestoPOS_Documentacion.docx
+++ b/RepuestoPOS_Documentacion.docx
@@ -115,7 +115,7 @@
           <w:sz w:val="22"/>
           <w:szCs w:val="22"/>
         </w:rPr>
-        <w:t xml:space="preserve">2. Acceso: Login y PIN</w:t>
+        <w:t xml:space="preserve">2. Acceso</w:t>
       </w:r>
     </w:p>
     <w:p>
@@ -938,24 +938,6 @@
                 <w:sz w:val="19"/>
                 <w:szCs w:val="19"/>
               </w:rPr>
-              <w:t xml:space="preserve">) y el PIN (</w:t>
-            </w:r>
-            <w:r>
-              <w:rPr>
-                <w:rFonts w:ascii="Courier New" w:cs="Courier New" w:eastAsia="Courier New" w:hAnsi="Courier New"/>
-                <w:color w:val="333333"/>
-                <w:sz w:val="19"/>
-                <w:szCs w:val="19"/>
-              </w:rPr>
-              <w:t xml:space="preserve">APP_PIN</w:t>
-            </w:r>
-            <w:r>
-              <w:rPr>
-                <w:rFonts w:ascii="Arial" w:cs="Arial" w:eastAsia="Arial" w:hAnsi="Arial"/>
-                <w:color w:val="333333"/>
-                <w:sz w:val="19"/>
-                <w:szCs w:val="19"/>
-              </w:rPr>
               <w:t xml:space="preserve">).</w:t>
             </w:r>
           </w:p>
@@ -1217,7 +1199,7 @@
           <w:sz w:val="32"/>
           <w:szCs w:val="32"/>
         </w:rPr>
-        <w:t xml:space="preserve">2. Acceso: Login y PIN</w:t>
+        <w:t xml:space="preserve">2. Acceso</w:t>
       </w:r>
     </w:p>
     <w:p>
@@ -1231,320 +1213,42 @@
           <w:sz w:val="20"/>
           <w:szCs w:val="20"/>
         </w:rPr>
-        <w:t xml:space="preserve">La app tiene dos niveles de acceso con funciones distintas:</w:t>
-      </w:r>
-    </w:p>
-    <w:tbl>
-      <w:tblPr>
-        <w:tblW w:type="dxa" w:w="9360"/>
-        <w:tblBorders>
-          <w:top w:val="single" w:color="auto" w:sz="4"/>
-          <w:left w:val="single" w:color="auto" w:sz="4"/>
-          <w:bottom w:val="single" w:color="auto" w:sz="4"/>
-          <w:right w:val="single" w:color="auto" w:sz="4"/>
-          <w:insideH w:val="single" w:color="auto" w:sz="4"/>
-          <w:insideV w:val="single" w:color="auto" w:sz="4"/>
-        </w:tblBorders>
-      </w:tblPr>
-      <w:tblGrid>
-        <w:gridCol w:w="2400"/>
-        <w:gridCol w:w="4160"/>
-        <w:gridCol w:w="2800"/>
-      </w:tblGrid>
-      <w:tr>
-        <w:trPr>
-          <w:tblHeader/>
-        </w:trPr>
-        <w:tc>
-          <w:tcPr>
-            <w:tcW w:type="dxa" w:w="2400"/>
-            <w:tcBorders>
-              <w:top w:val="single" w:color="D0D0D0" w:sz="4"/>
-              <w:left w:val="single" w:color="D0D0D0" w:sz="4"/>
-              <w:bottom w:val="single" w:color="D0D0D0" w:sz="4"/>
-              <w:right w:val="single" w:color="D0D0D0" w:sz="4"/>
-            </w:tcBorders>
-            <w:shd w:fill="1E5AA8" w:color="auto" w:val="clear"/>
-            <w:tcMar>
-              <w:top w:type="dxa" w:w="60"/>
-              <w:left w:type="dxa" w:w="100"/>
-              <w:bottom w:type="dxa" w:w="60"/>
-              <w:right w:type="dxa" w:w="100"/>
-            </w:tcMar>
-          </w:tcPr>
-          <w:p>
-            <w:r>
-              <w:rPr>
-                <w:rFonts w:ascii="Arial" w:cs="Arial" w:eastAsia="Arial" w:hAnsi="Arial"/>
-                <w:b/>
-                <w:bCs/>
-                <w:color w:val="FFFFFF"/>
-                <w:sz w:val="18"/>
-                <w:szCs w:val="18"/>
-              </w:rPr>
-              <w:t xml:space="preserve">NIVEL</w:t>
-            </w:r>
-          </w:p>
-        </w:tc>
-        <w:tc>
-          <w:tcPr>
-            <w:tcW w:type="dxa" w:w="4160"/>
-            <w:tcBorders>
-              <w:top w:val="single" w:color="D0D0D0" w:sz="4"/>
-              <w:left w:val="single" w:color="D0D0D0" w:sz="4"/>
-              <w:bottom w:val="single" w:color="D0D0D0" w:sz="4"/>
-              <w:right w:val="single" w:color="D0D0D0" w:sz="4"/>
-            </w:tcBorders>
-            <w:shd w:fill="1E5AA8" w:color="auto" w:val="clear"/>
-            <w:tcMar>
-              <w:top w:type="dxa" w:w="60"/>
-              <w:left w:type="dxa" w:w="100"/>
-              <w:bottom w:type="dxa" w:w="60"/>
-              <w:right w:type="dxa" w:w="100"/>
-            </w:tcMar>
-          </w:tcPr>
-          <w:p>
-            <w:r>
-              <w:rPr>
-                <w:rFonts w:ascii="Arial" w:cs="Arial" w:eastAsia="Arial" w:hAnsi="Arial"/>
-                <w:b/>
-                <w:bCs/>
-                <w:color w:val="FFFFFF"/>
-                <w:sz w:val="18"/>
-                <w:szCs w:val="18"/>
-              </w:rPr>
-              <w:t xml:space="preserve">PARA QUÉ SIRVE</w:t>
-            </w:r>
-          </w:p>
-        </w:tc>
-        <w:tc>
-          <w:tcPr>
-            <w:tcW w:type="dxa" w:w="2800"/>
-            <w:tcBorders>
-              <w:top w:val="single" w:color="D0D0D0" w:sz="4"/>
-              <w:left w:val="single" w:color="D0D0D0" w:sz="4"/>
-              <w:bottom w:val="single" w:color="D0D0D0" w:sz="4"/>
-              <w:right w:val="single" w:color="D0D0D0" w:sz="4"/>
-            </w:tcBorders>
-            <w:shd w:fill="1E5AA8" w:color="auto" w:val="clear"/>
-            <w:tcMar>
-              <w:top w:type="dxa" w:w="60"/>
-              <w:left w:type="dxa" w:w="100"/>
-              <w:bottom w:type="dxa" w:w="60"/>
-              <w:right w:type="dxa" w:w="100"/>
-            </w:tcMar>
-          </w:tcPr>
-          <w:p>
-            <w:r>
-              <w:rPr>
-                <w:rFonts w:ascii="Arial" w:cs="Arial" w:eastAsia="Arial" w:hAnsi="Arial"/>
-                <w:b/>
-                <w:bCs/>
-                <w:color w:val="FFFFFF"/>
-                <w:sz w:val="18"/>
-                <w:szCs w:val="18"/>
-              </w:rPr>
-              <w:t xml:space="preserve">CUÁNDO SE PIDE</w:t>
-            </w:r>
-          </w:p>
-        </w:tc>
-      </w:tr>
-      <w:tr>
-        <w:tc>
-          <w:tcPr>
-            <w:tcW w:type="dxa" w:w="2400"/>
-            <w:tcBorders>
-              <w:top w:val="single" w:color="D0D0D0" w:sz="4"/>
-              <w:left w:val="single" w:color="D0D0D0" w:sz="4"/>
-              <w:bottom w:val="single" w:color="D0D0D0" w:sz="4"/>
-              <w:right w:val="single" w:color="D0D0D0" w:sz="4"/>
-            </w:tcBorders>
-            <w:shd w:fill="FFFFFF" w:color="auto" w:val="clear"/>
-            <w:tcMar>
-              <w:top w:type="dxa" w:w="60"/>
-              <w:left w:type="dxa" w:w="100"/>
-              <w:bottom w:type="dxa" w:w="60"/>
-              <w:right w:type="dxa" w:w="100"/>
-            </w:tcMar>
-          </w:tcPr>
-          <w:p>
-            <w:r>
-              <w:rPr>
-                <w:rFonts w:ascii="Arial" w:cs="Arial" w:eastAsia="Arial" w:hAnsi="Arial"/>
-                <w:b/>
-                <w:bCs/>
-                <w:color w:val="333333"/>
-                <w:sz w:val="19"/>
-                <w:szCs w:val="19"/>
-              </w:rPr>
-              <w:t xml:space="preserve">Login</w:t>
-            </w:r>
-            <w:r>
-              <w:rPr>
-                <w:rFonts w:ascii="Arial" w:cs="Arial" w:eastAsia="Arial" w:hAnsi="Arial"/>
-                <w:color w:val="333333"/>
-                <w:sz w:val="19"/>
-                <w:szCs w:val="19"/>
-              </w:rPr>
-              <w:t xml:space="preserve"> (email + contraseña del local)</w:t>
-            </w:r>
-          </w:p>
-        </w:tc>
-        <w:tc>
-          <w:tcPr>
-            <w:tcW w:type="dxa" w:w="4160"/>
-            <w:tcBorders>
-              <w:top w:val="single" w:color="D0D0D0" w:sz="4"/>
-              <w:left w:val="single" w:color="D0D0D0" w:sz="4"/>
-              <w:bottom w:val="single" w:color="D0D0D0" w:sz="4"/>
-              <w:right w:val="single" w:color="D0D0D0" w:sz="4"/>
-            </w:tcBorders>
-            <w:shd w:fill="FFFFFF" w:color="auto" w:val="clear"/>
-            <w:tcMar>
-              <w:top w:type="dxa" w:w="60"/>
-              <w:left w:type="dxa" w:w="100"/>
-              <w:bottom w:type="dxa" w:w="60"/>
-              <w:right w:type="dxa" w:w="100"/>
-            </w:tcMar>
-          </w:tcPr>
-          <w:p>
-            <w:r>
-              <w:rPr>
-                <w:rFonts w:ascii="Arial" w:cs="Arial" w:eastAsia="Arial" w:hAnsi="Arial"/>
-                <w:color w:val="333333"/>
-                <w:sz w:val="19"/>
-                <w:szCs w:val="19"/>
-              </w:rPr>
-              <w:t xml:space="preserve">Es lo que protege los datos. Sin sesión iniciada, la base de datos rechaza toda lectura y escritura.</w:t>
-            </w:r>
-          </w:p>
-        </w:tc>
-        <w:tc>
-          <w:tcPr>
-            <w:tcW w:type="dxa" w:w="2800"/>
-            <w:tcBorders>
-              <w:top w:val="single" w:color="D0D0D0" w:sz="4"/>
-              <w:left w:val="single" w:color="D0D0D0" w:sz="4"/>
-              <w:bottom w:val="single" w:color="D0D0D0" w:sz="4"/>
-              <w:right w:val="single" w:color="D0D0D0" w:sz="4"/>
-            </w:tcBorders>
-            <w:shd w:fill="FFFFFF" w:color="auto" w:val="clear"/>
-            <w:tcMar>
-              <w:top w:type="dxa" w:w="60"/>
-              <w:left w:type="dxa" w:w="100"/>
-              <w:bottom w:type="dxa" w:w="60"/>
-              <w:right w:type="dxa" w:w="100"/>
-            </w:tcMar>
-          </w:tcPr>
-          <w:p>
-            <w:r>
-              <w:rPr>
-                <w:rFonts w:ascii="Arial" w:cs="Arial" w:eastAsia="Arial" w:hAnsi="Arial"/>
-                <w:color w:val="333333"/>
-                <w:sz w:val="19"/>
-                <w:szCs w:val="19"/>
-              </w:rPr>
-              <w:t xml:space="preserve">La primera vez en cada PC, o si se cierra la sesión. La sesión queda guardada y se renueva sola.</w:t>
-            </w:r>
-          </w:p>
-        </w:tc>
-      </w:tr>
-      <w:tr>
-        <w:tc>
-          <w:tcPr>
-            <w:tcW w:type="dxa" w:w="2400"/>
-            <w:tcBorders>
-              <w:top w:val="single" w:color="D0D0D0" w:sz="4"/>
-              <w:left w:val="single" w:color="D0D0D0" w:sz="4"/>
-              <w:bottom w:val="single" w:color="D0D0D0" w:sz="4"/>
-              <w:right w:val="single" w:color="D0D0D0" w:sz="4"/>
-            </w:tcBorders>
-            <w:shd w:fill="F5F5F5" w:color="auto" w:val="clear"/>
-            <w:tcMar>
-              <w:top w:type="dxa" w:w="60"/>
-              <w:left w:type="dxa" w:w="100"/>
-              <w:bottom w:type="dxa" w:w="60"/>
-              <w:right w:type="dxa" w:w="100"/>
-            </w:tcMar>
-          </w:tcPr>
-          <w:p>
-            <w:r>
-              <w:rPr>
-                <w:rFonts w:ascii="Arial" w:cs="Arial" w:eastAsia="Arial" w:hAnsi="Arial"/>
-                <w:b/>
-                <w:bCs/>
-                <w:color w:val="333333"/>
-                <w:sz w:val="19"/>
-                <w:szCs w:val="19"/>
-              </w:rPr>
-              <w:t xml:space="preserve">PIN</w:t>
-            </w:r>
-          </w:p>
-        </w:tc>
-        <w:tc>
-          <w:tcPr>
-            <w:tcW w:type="dxa" w:w="4160"/>
-            <w:tcBorders>
-              <w:top w:val="single" w:color="D0D0D0" w:sz="4"/>
-              <w:left w:val="single" w:color="D0D0D0" w:sz="4"/>
-              <w:bottom w:val="single" w:color="D0D0D0" w:sz="4"/>
-              <w:right w:val="single" w:color="D0D0D0" w:sz="4"/>
-            </w:tcBorders>
-            <w:shd w:fill="F5F5F5" w:color="auto" w:val="clear"/>
-            <w:tcMar>
-              <w:top w:type="dxa" w:w="60"/>
-              <w:left w:type="dxa" w:w="100"/>
-              <w:bottom w:type="dxa" w:w="60"/>
-              <w:right w:type="dxa" w:w="100"/>
-            </w:tcMar>
-          </w:tcPr>
-          <w:p>
-            <w:r>
-              <w:rPr>
-                <w:rFonts w:ascii="Arial" w:cs="Arial" w:eastAsia="Arial" w:hAnsi="Arial"/>
-                <w:color w:val="333333"/>
-                <w:sz w:val="19"/>
-                <w:szCs w:val="19"/>
-              </w:rPr>
-              <w:t xml:space="preserve">Bloqueo rápido de pantalla cuando el operador se aleja de la caja. No cierra la sesión.</w:t>
-            </w:r>
-          </w:p>
-        </w:tc>
-        <w:tc>
-          <w:tcPr>
-            <w:tcW w:type="dxa" w:w="2800"/>
-            <w:tcBorders>
-              <w:top w:val="single" w:color="D0D0D0" w:sz="4"/>
-              <w:left w:val="single" w:color="D0D0D0" w:sz="4"/>
-              <w:bottom w:val="single" w:color="D0D0D0" w:sz="4"/>
-              <w:right w:val="single" w:color="D0D0D0" w:sz="4"/>
-            </w:tcBorders>
-            <w:shd w:fill="F5F5F5" w:color="auto" w:val="clear"/>
-            <w:tcMar>
-              <w:top w:type="dxa" w:w="60"/>
-              <w:left w:type="dxa" w:w="100"/>
-              <w:bottom w:type="dxa" w:w="60"/>
-              <w:right w:type="dxa" w:w="100"/>
-            </w:tcMar>
-          </w:tcPr>
-          <w:p>
-            <w:r>
-              <w:rPr>
-                <w:rFonts w:ascii="Arial" w:cs="Arial" w:eastAsia="Arial" w:hAnsi="Arial"/>
-                <w:color w:val="333333"/>
-                <w:sz w:val="19"/>
-                <w:szCs w:val="19"/>
-              </w:rPr>
-              <w:t xml:space="preserve">Al abrir la app y cada vez que se toca el botón 🔒 de la barra superior.</w:t>
-            </w:r>
-          </w:p>
-        </w:tc>
-      </w:tr>
-    </w:tbl>
-    <w:p>
-      <w:pPr>
-        <w:spacing w:after="120"/>
-      </w:pPr>
+        <w:t xml:space="preserve">El acceso se hace con el </w:t>
+      </w:r>
+      <w:r>
+        <w:rPr>
+          <w:rFonts w:ascii="Arial" w:cs="Arial" w:eastAsia="Arial" w:hAnsi="Arial"/>
+          <w:b/>
+          <w:bCs/>
+          <w:color w:val="333333"/>
+          <w:sz w:val="20"/>
+          <w:szCs w:val="20"/>
+        </w:rPr>
+        <w:t xml:space="preserve">email y la contraseña del local</w:t>
+      </w:r>
+      <w:r>
+        <w:rPr>
+          <w:rFonts w:ascii="Arial" w:cs="Arial" w:eastAsia="Arial" w:hAnsi="Arial"/>
+          <w:color w:val="333333"/>
+          <w:sz w:val="20"/>
+          <w:szCs w:val="20"/>
+        </w:rPr>
+        <w:t xml:space="preserve"> (Supabase Auth). Es lo que protege los datos: sin sesión iniciada, la base de datos rechaza toda lectura y escritura. Se pide la primera vez en cada PC o después de cerrar sesión; la sesión queda guardada y se renueva sola.</w:t>
+      </w:r>
+    </w:p>
+    <w:p>
+      <w:pPr>
+        <w:spacing w:after="120" w:line="276"/>
+      </w:pPr>
+      <w:r>
+        <w:rPr>
+          <w:rFonts w:ascii="Arial" w:cs="Arial" w:eastAsia="Arial" w:hAnsi="Arial"/>
+          <w:color w:val="333333"/>
+          <w:sz w:val="20"/>
+          <w:szCs w:val="20"/>
+        </w:rPr>
+        <w:t xml:space="preserve">Como el sistema lo usa solo el dueño, no hay PIN ni bloqueo de pantalla. Si en el futuro lo usan empleados, conviene cerrar sesión al dejar la PC o agregar usuarios con permisos distintos.</w:t>
+      </w:r>
     </w:p>
     <w:tbl>
       <w:tblPr>
@@ -1665,56 +1369,6 @@
                 <w:szCs w:val="20"/>
               </w:rPr>
               <w:t xml:space="preserve"> (Authentication → Sign In / Providers). Si se activa, cualquiera con esa clave podría crearse una cuenta y acceder a los datos.</w:t>
-            </w:r>
-          </w:p>
-          <w:p>
-            <w:pPr>
-              <w:spacing w:after="60"/>
-            </w:pPr>
-            <w:r>
-              <w:rPr>
-                <w:rFonts w:ascii="Arial" w:cs="Arial" w:eastAsia="Arial" w:hAnsi="Arial"/>
-                <w:color w:val="333333"/>
-                <w:sz w:val="20"/>
-                <w:szCs w:val="20"/>
-              </w:rPr>
-              <w:t xml:space="preserve">El PIN también queda visible en el código: es solo un freno contra el acceso casual. Conviene cambiar el valor por defecto </w:t>
-            </w:r>
-            <w:r>
-              <w:rPr>
-                <w:rFonts w:ascii="Courier New" w:cs="Courier New" w:eastAsia="Courier New" w:hAnsi="Courier New"/>
-                <w:color w:val="333333"/>
-                <w:sz w:val="19"/>
-                <w:szCs w:val="19"/>
-              </w:rPr>
-              <w:t xml:space="preserve">1234</w:t>
-            </w:r>
-            <w:r>
-              <w:rPr>
-                <w:rFonts w:ascii="Arial" w:cs="Arial" w:eastAsia="Arial" w:hAnsi="Arial"/>
-                <w:color w:val="333333"/>
-                <w:sz w:val="20"/>
-                <w:szCs w:val="20"/>
-              </w:rPr>
-              <w:t xml:space="preserve"> en la variable </w:t>
-            </w:r>
-            <w:r>
-              <w:rPr>
-                <w:rFonts w:ascii="Courier New" w:cs="Courier New" w:eastAsia="Courier New" w:hAnsi="Courier New"/>
-                <w:color w:val="333333"/>
-                <w:sz w:val="19"/>
-                <w:szCs w:val="19"/>
-              </w:rPr>
-              <w:t xml:space="preserve">APP_PIN</w:t>
-            </w:r>
-            <w:r>
-              <w:rPr>
-                <w:rFonts w:ascii="Arial" w:cs="Arial" w:eastAsia="Arial" w:hAnsi="Arial"/>
-                <w:color w:val="333333"/>
-                <w:sz w:val="20"/>
-                <w:szCs w:val="20"/>
-              </w:rPr>
-              <w:t xml:space="preserve">.</w:t>
             </w:r>
           </w:p>
         </w:tc>
@@ -7362,7 +7016,7 @@
                 <w:sz w:val="19"/>
                 <w:szCs w:val="19"/>
               </w:rPr>
-              <w:t xml:space="preserve">rpos_unlocked</w:t>
+              <w:t xml:space="preserve">rpos_cache_prod</w:t>
             </w:r>
           </w:p>
         </w:tc>
@@ -7391,7 +7045,7 @@
                 <w:sz w:val="19"/>
                 <w:szCs w:val="19"/>
               </w:rPr>
-              <w:t xml:space="preserve">Indica que se ingresó el PIN.</w:t>
+              <w:t xml:space="preserve">Copia del catálogo de productos.</w:t>
             </w:r>
           </w:p>
         </w:tc>
@@ -7422,7 +7076,7 @@
                 <w:sz w:val="19"/>
                 <w:szCs w:val="19"/>
               </w:rPr>
-              <w:t xml:space="preserve">rpos_cache_prod</w:t>
+              <w:t xml:space="preserve">rpos_cache_hist</w:t>
             </w:r>
           </w:p>
         </w:tc>
@@ -7451,7 +7105,7 @@
                 <w:sz w:val="19"/>
                 <w:szCs w:val="19"/>
               </w:rPr>
-              <w:t xml:space="preserve">Copia del catálogo de productos.</w:t>
+              <w:t xml:space="preserve">Copia del historial cargado.</w:t>
             </w:r>
           </w:p>
         </w:tc>
@@ -7482,7 +7136,7 @@
                 <w:sz w:val="19"/>
                 <w:szCs w:val="19"/>
               </w:rPr>
-              <w:t xml:space="preserve">rpos_cache_hist</w:t>
+              <w:t xml:space="preserve">rpos_pending_ventas</w:t>
             </w:r>
           </w:p>
         </w:tc>
@@ -7511,7 +7165,18 @@
                 <w:sz w:val="19"/>
                 <w:szCs w:val="19"/>
               </w:rPr>
-              <w:t xml:space="preserve">Copia del historial cargado.</w:t>
+              <w:t xml:space="preserve">Cola de ventas que todavía no llegaron a la base. </w:t>
+            </w:r>
+            <w:r>
+              <w:rPr>
+                <w:rFonts w:ascii="Arial" w:cs="Arial" w:eastAsia="Arial" w:hAnsi="Arial"/>
+                <w:b/>
+                <w:bCs/>
+                <w:color w:val="333333"/>
+                <w:sz w:val="19"/>
+                <w:szCs w:val="19"/>
+              </w:rPr>
+              <w:t xml:space="preserve">No borrar.</w:t>
             </w:r>
           </w:p>
         </w:tc>
@@ -7542,7 +7207,7 @@
                 <w:sz w:val="19"/>
                 <w:szCs w:val="19"/>
               </w:rPr>
-              <w:t xml:space="preserve">rpos_pending_ventas</w:t>
+              <w:t xml:space="preserve">rpos_vnum</w:t>
             </w:r>
           </w:p>
         </w:tc>
@@ -7571,18 +7236,25 @@
                 <w:sz w:val="19"/>
                 <w:szCs w:val="19"/>
               </w:rPr>
-              <w:t xml:space="preserve">Cola de ventas que todavía no llegaron a la base. </w:t>
-            </w:r>
-            <w:r>
-              <w:rPr>
-                <w:rFonts w:ascii="Arial" w:cs="Arial" w:eastAsia="Arial" w:hAnsi="Arial"/>
-                <w:b/>
-                <w:bCs/>
-                <w:color w:val="333333"/>
-                <w:sz w:val="19"/>
-                <w:szCs w:val="19"/>
-              </w:rPr>
-              <w:t xml:space="preserve">No borrar.</w:t>
+              <w:t xml:space="preserve">Contador de números provisorios (</w:t>
+            </w:r>
+            <w:r>
+              <w:rPr>
+                <w:rFonts w:ascii="Courier New" w:cs="Courier New" w:eastAsia="Courier New" w:hAnsi="Courier New"/>
+                <w:color w:val="333333"/>
+                <w:sz w:val="19"/>
+                <w:szCs w:val="19"/>
+              </w:rPr>
+              <w:t xml:space="preserve">P-xxxx</w:t>
+            </w:r>
+            <w:r>
+              <w:rPr>
+                <w:rFonts w:ascii="Arial" w:cs="Arial" w:eastAsia="Arial" w:hAnsi="Arial"/>
+                <w:color w:val="333333"/>
+                <w:sz w:val="19"/>
+                <w:szCs w:val="19"/>
+              </w:rPr>
+              <w:t xml:space="preserve">) de esa PC.</w:t>
             </w:r>
           </w:p>
         </w:tc>
@@ -7613,7 +7285,7 @@
                 <w:sz w:val="19"/>
                 <w:szCs w:val="19"/>
               </w:rPr>
-              <w:t xml:space="preserve">rpos_vnum</w:t>
+              <w:t xml:space="preserve">rpos_presnum</w:t>
             </w:r>
           </w:p>
         </w:tc>
@@ -7627,84 +7299,6 @@
               <w:right w:val="single" w:color="D0D0D0" w:sz="4"/>
             </w:tcBorders>
             <w:shd w:fill="F5F5F5" w:color="auto" w:val="clear"/>
-            <w:tcMar>
-              <w:top w:type="dxa" w:w="60"/>
-              <w:left w:type="dxa" w:w="100"/>
-              <w:bottom w:type="dxa" w:w="60"/>
-              <w:right w:type="dxa" w:w="100"/>
-            </w:tcMar>
-          </w:tcPr>
-          <w:p>
-            <w:r>
-              <w:rPr>
-                <w:rFonts w:ascii="Arial" w:cs="Arial" w:eastAsia="Arial" w:hAnsi="Arial"/>
-                <w:color w:val="333333"/>
-                <w:sz w:val="19"/>
-                <w:szCs w:val="19"/>
-              </w:rPr>
-              <w:t xml:space="preserve">Contador de números provisorios (</w:t>
-            </w:r>
-            <w:r>
-              <w:rPr>
-                <w:rFonts w:ascii="Courier New" w:cs="Courier New" w:eastAsia="Courier New" w:hAnsi="Courier New"/>
-                <w:color w:val="333333"/>
-                <w:sz w:val="19"/>
-                <w:szCs w:val="19"/>
-              </w:rPr>
-              <w:t xml:space="preserve">P-xxxx</w:t>
-            </w:r>
-            <w:r>
-              <w:rPr>
-                <w:rFonts w:ascii="Arial" w:cs="Arial" w:eastAsia="Arial" w:hAnsi="Arial"/>
-                <w:color w:val="333333"/>
-                <w:sz w:val="19"/>
-                <w:szCs w:val="19"/>
-              </w:rPr>
-              <w:t xml:space="preserve">) de esa PC.</w:t>
-            </w:r>
-          </w:p>
-        </w:tc>
-      </w:tr>
-      <w:tr>
-        <w:tc>
-          <w:tcPr>
-            <w:tcW w:type="dxa" w:w="2800"/>
-            <w:tcBorders>
-              <w:top w:val="single" w:color="D0D0D0" w:sz="4"/>
-              <w:left w:val="single" w:color="D0D0D0" w:sz="4"/>
-              <w:bottom w:val="single" w:color="D0D0D0" w:sz="4"/>
-              <w:right w:val="single" w:color="D0D0D0" w:sz="4"/>
-            </w:tcBorders>
-            <w:shd w:fill="FFFFFF" w:color="auto" w:val="clear"/>
-            <w:tcMar>
-              <w:top w:type="dxa" w:w="60"/>
-              <w:left w:type="dxa" w:w="100"/>
-              <w:bottom w:type="dxa" w:w="60"/>
-              <w:right w:type="dxa" w:w="100"/>
-            </w:tcMar>
-          </w:tcPr>
-          <w:p>
-            <w:r>
-              <w:rPr>
-                <w:rFonts w:ascii="Courier New" w:cs="Courier New" w:eastAsia="Courier New" w:hAnsi="Courier New"/>
-                <w:color w:val="333333"/>
-                <w:sz w:val="19"/>
-                <w:szCs w:val="19"/>
-              </w:rPr>
-              <w:t xml:space="preserve">rpos_presnum</w:t>
-            </w:r>
-          </w:p>
-        </w:tc>
-        <w:tc>
-          <w:tcPr>
-            <w:tcW w:type="dxa" w:w="6560"/>
-            <w:tcBorders>
-              <w:top w:val="single" w:color="D0D0D0" w:sz="4"/>
-              <w:left w:val="single" w:color="D0D0D0" w:sz="4"/>
-              <w:bottom w:val="single" w:color="D0D0D0" w:sz="4"/>
-              <w:right w:val="single" w:color="D0D0D0" w:sz="4"/>
-            </w:tcBorders>
-            <w:shd w:fill="FFFFFF" w:color="auto" w:val="clear"/>
             <w:tcMar>
               <w:top w:type="dxa" w:w="60"/>
               <w:left w:type="dxa" w:w="100"/>
@@ -9920,7 +9514,7 @@
                 <w:sz w:val="19"/>
                 <w:szCs w:val="19"/>
               </w:rPr>
-              <w:t xml:space="preserve">Login con email/contraseña + PIN de bloqueo</w:t>
+              <w:t xml:space="preserve">Login con email y contraseña (Supabase Auth)</w:t>
             </w:r>
           </w:p>
         </w:tc>

</xml_diff>